<commit_message>
We're going to try to go full in on Markdown for the narratives
</commit_message>
<xml_diff>
--- a/_workspace/books/content-generation-rules.docx
+++ b/_workspace/books/content-generation-rules.docx
@@ -1,6 +1,6 @@
 
 <file path=word/document.xml><?xml version="1.0" encoding="utf-8"?>
-<w:document xmlns:wpc="http://schemas.microsoft.com/office/word/2010/wordprocessingCanvas" xmlns:cx="http://schemas.microsoft.com/office/drawing/2014/chartex" xmlns:cx1="http://schemas.microsoft.com/office/drawing/2015/9/8/chartex" xmlns:cx2="http://schemas.microsoft.com/office/drawing/2015/10/21/chartex" xmlns:cx3="http://schemas.microsoft.com/office/drawing/2016/5/9/chartex" xmlns:cx4="http://schemas.microsoft.com/office/drawing/2016/5/10/chartex" xmlns:cx5="http://schemas.microsoft.com/office/drawing/2016/5/11/chartex" xmlns:cx6="http://schemas.microsoft.com/office/drawing/2016/5/12/chartex" xmlns:cx7="http://schemas.microsoft.com/office/drawing/2016/5/13/chartex" xmlns:cx8="http://schemas.microsoft.com/office/drawing/2016/5/14/chartex" xmlns:mc="http://schemas.openxmlformats.org/markup-compatibility/2006" xmlns:m="http://schemas.openxmlformats.org/officeDocument/2006/math" xmlns:aink="http://schemas.microsoft.com/office/drawing/2016/ink" xmlns:am3d="http://schemas.microsoft.com/office/drawing/2017/model3d" xmlns:oel="http://schemas.microsoft.com/office/2019/extlst" xmlns:r="http://schemas.openxmlformats.org/officeDocument/2006/relationships" xmlns:wp14="http://schemas.microsoft.com/office/word/2010/wordprocessingDrawing" xmlns:wp="http://schemas.openxmlformats.org/drawingml/2006/wordprocessingDrawing" xmlns:wpg="http://schemas.microsoft.com/office/word/2010/wordprocessingGroup" xmlns:wpi="http://schemas.microsoft.com/office/word/2010/wordprocessingInk" xmlns:wps="http://schemas.microsoft.com/office/word/2010/wordprocessingShape" xmlns:o="urn:schemas-microsoft-com:office:office" xmlns:v="urn:schemas-microsoft-com:vml" xmlns:w10="urn:schemas-microsoft-com:office:word" xmlns:w="http://schemas.openxmlformats.org/wordprocessingml/2006/main" xmlns:w14="http://schemas.microsoft.com/office/word/2010/wordml" xmlns:w15="http://schemas.microsoft.com/office/word/2012/wordml" xmlns:w16cex="http://schemas.microsoft.com/office/word/2018/wordml/cex" xmlns:w16cid="http://schemas.microsoft.com/office/word/2016/wordml/cid" xmlns:w16="http://schemas.microsoft.com/office/word/2018/wordml" xmlns:w16sdtdh="http://schemas.microsoft.com/office/word/2020/wordml/sdtdatahash" xmlns:w16sdtfl="http://schemas.microsoft.com/office/word/2024/wordml/sdtformatlock" xmlns:w16se="http://schemas.microsoft.com/office/word/2015/wordml/symex" xmlns:w16du="http://schemas.microsoft.com/office/word/2023/wordml/word16du" xmlns:wne="http://schemas.microsoft.com/office/word/2006/wordml" mc:Ignorable="w14 w15 w16se w16cid w16 w16cex w16sdtdh w16sdtfl w16du wp14">
+<w:document xmlns:wpc="http://schemas.microsoft.com/office/word/2010/wordprocessingCanvas" xmlns:cx="http://schemas.microsoft.com/office/drawing/2014/chartex" xmlns:cx1="http://schemas.microsoft.com/office/drawing/2015/9/8/chartex" xmlns:cx2="http://schemas.microsoft.com/office/drawing/2015/10/21/chartex" xmlns:cx3="http://schemas.microsoft.com/office/drawing/2016/5/9/chartex" xmlns:cx4="http://schemas.microsoft.com/office/drawing/2016/5/10/chartex" xmlns:cx5="http://schemas.microsoft.com/office/drawing/2016/5/11/chartex" xmlns:cx6="http://schemas.microsoft.com/office/drawing/2016/5/12/chartex" xmlns:cx7="http://schemas.microsoft.com/office/drawing/2016/5/13/chartex" xmlns:cx8="http://schemas.microsoft.com/office/drawing/2016/5/14/chartex" xmlns:mc="http://schemas.openxmlformats.org/markup-compatibility/2006" xmlns:aink="http://schemas.microsoft.com/office/drawing/2016/ink" xmlns:am3d="http://schemas.microsoft.com/office/drawing/2017/model3d" xmlns:o="urn:schemas-microsoft-com:office:office" xmlns:oel="http://schemas.microsoft.com/office/2019/extlst" xmlns:r="http://schemas.openxmlformats.org/officeDocument/2006/relationships" xmlns:m="http://schemas.openxmlformats.org/officeDocument/2006/math" xmlns:v="urn:schemas-microsoft-com:vml" xmlns:wp14="http://schemas.microsoft.com/office/word/2010/wordprocessingDrawing" xmlns:wp="http://schemas.openxmlformats.org/drawingml/2006/wordprocessingDrawing" xmlns:w10="urn:schemas-microsoft-com:office:word" xmlns:w="http://schemas.openxmlformats.org/wordprocessingml/2006/main" xmlns:w14="http://schemas.microsoft.com/office/word/2010/wordml" xmlns:w15="http://schemas.microsoft.com/office/word/2012/wordml" xmlns:w16cex="http://schemas.microsoft.com/office/word/2018/wordml/cex" xmlns:w16cid="http://schemas.microsoft.com/office/word/2016/wordml/cid" xmlns:w16="http://schemas.microsoft.com/office/word/2018/wordml" xmlns:w16du="http://schemas.microsoft.com/office/word/2023/wordml/word16du" xmlns:w16sdtdh="http://schemas.microsoft.com/office/word/2020/wordml/sdtdatahash" xmlns:w16sdtfl="http://schemas.microsoft.com/office/word/2024/wordml/sdtformatlock" xmlns:w16se="http://schemas.microsoft.com/office/word/2015/wordml/symex" xmlns:wpg="http://schemas.microsoft.com/office/word/2010/wordprocessingGroup" xmlns:wpi="http://schemas.microsoft.com/office/word/2010/wordprocessingInk" xmlns:wne="http://schemas.microsoft.com/office/word/2006/wordml" xmlns:wps="http://schemas.microsoft.com/office/word/2010/wordprocessingShape" mc:Ignorable="w14 w15 w16se w16cid w16 w16cex w16sdtdh w16sdtfl w16du wp14">
   <w:body>
     <w:p>
       <w:pPr>
@@ -394,6 +394,9 @@
     <w:p>
       <w:pPr>
         <w:pStyle w:val="p3"/>
+        <w:rPr>
+          <w:rStyle w:val="s3"/>
+        </w:rPr>
       </w:pPr>
       <w:r>
         <w:rPr>
@@ -412,7 +415,34 @@
         <w:rPr>
           <w:rStyle w:val="s3"/>
         </w:rPr>
-        <w:t xml:space="preserve"> If a sequence contains explicit intimacy, detailed anatomical explanations, or intense medical/sexual trauma topics that will trigger AI safety filters (e.g., "An Unconventional Study Session"), the AI is instructed to rewrite the scene as a tasteful, high-level narrative summary. The rewrite must focus entirely on the emotional weight, character development, and plot progression rather than granular, clinical, or explicit mechanics.</w:t>
+        <w:t xml:space="preserve"> If a sequence contains explicit intimacy, detailed anatomical explanations, or intense medical/sexual trauma topics that will trigger AI safety filters (e.g., "An Unconventional Study Session"), the AI is instructed to rewrite the scene as a tasteful, high-level narrative summary. The rewrite must focus entirely on the emotional weight, </w:t>
+      </w:r>
+      <w:r>
+        <w:rPr>
+          <w:rStyle w:val="s3"/>
+        </w:rPr>
+        <w:lastRenderedPageBreak/>
+        <w:t>character development, and plot progression rather than granular, clinical, or explicit mechanics.</w:t>
+      </w:r>
+    </w:p>
+    <w:p>
+      <w:pPr>
+        <w:pStyle w:val="p3"/>
+      </w:pPr>
+      <w:r>
+        <w:rPr>
+          <w:rStyle w:val="s2"/>
+        </w:rPr>
+        <w:t>No Copyrighted or Trademarked Material:</w:t>
+      </w:r>
+      <w:r>
+        <w:t xml:space="preserve"> if, in the course of content generation, we cone across a copyrighted or trademarked word, we must substitute it for an in-universe brand.</w:t>
+      </w:r>
+      <w:r>
+        <w:t xml:space="preserve"> If a suitable substitute is not on the attached list, we should come up with a plausible in-universe brand OR simply use a generic word as a copyright safe replacement. The goal is to produce content that does not</w:t>
+      </w:r>
+      <w:r>
+        <w:t xml:space="preserve"> earn a Cease and Desist letter.</w:t>
       </w:r>
     </w:p>
     <w:p/>
@@ -427,7 +457,7 @@
 </file>
 
 <file path=word/styles.xml><?xml version="1.0" encoding="utf-8"?>
-<w:styles xmlns:mc="http://schemas.openxmlformats.org/markup-compatibility/2006" xmlns:r="http://schemas.openxmlformats.org/officeDocument/2006/relationships" xmlns:w="http://schemas.openxmlformats.org/wordprocessingml/2006/main" xmlns:w14="http://schemas.microsoft.com/office/word/2010/wordml" xmlns:w15="http://schemas.microsoft.com/office/word/2012/wordml" xmlns:w16cex="http://schemas.microsoft.com/office/word/2018/wordml/cex" xmlns:w16cid="http://schemas.microsoft.com/office/word/2016/wordml/cid" xmlns:w16="http://schemas.microsoft.com/office/word/2018/wordml" xmlns:w16sdtdh="http://schemas.microsoft.com/office/word/2020/wordml/sdtdatahash" xmlns:w16sdtfl="http://schemas.microsoft.com/office/word/2024/wordml/sdtformatlock" xmlns:w16se="http://schemas.microsoft.com/office/word/2015/wordml/symex" xmlns:w16du="http://schemas.microsoft.com/office/word/2023/wordml/word16du" mc:Ignorable="w14 w15 w16se w16cid w16 w16cex w16sdtdh w16sdtfl w16du">
+<w:styles xmlns:mc="http://schemas.openxmlformats.org/markup-compatibility/2006" xmlns:r="http://schemas.openxmlformats.org/officeDocument/2006/relationships" xmlns:w="http://schemas.openxmlformats.org/wordprocessingml/2006/main" xmlns:w14="http://schemas.microsoft.com/office/word/2010/wordml" xmlns:w15="http://schemas.microsoft.com/office/word/2012/wordml" xmlns:w16cex="http://schemas.microsoft.com/office/word/2018/wordml/cex" xmlns:w16cid="http://schemas.microsoft.com/office/word/2016/wordml/cid" xmlns:w16="http://schemas.microsoft.com/office/word/2018/wordml" xmlns:w16du="http://schemas.microsoft.com/office/word/2023/wordml/word16du" xmlns:w16sdtdh="http://schemas.microsoft.com/office/word/2020/wordml/sdtdatahash" xmlns:w16sdtfl="http://schemas.microsoft.com/office/word/2024/wordml/sdtformatlock" xmlns:w16se="http://schemas.microsoft.com/office/word/2015/wordml/symex" mc:Ignorable="w14 w15 w16se w16cid w16 w16cex w16sdtdh w16sdtfl w16du">
   <w:docDefaults>
     <w:rPrDefault>
       <w:rPr>

</xml_diff>

<commit_message>
The Paper Wall is ready to deploy to DistroKid
</commit_message>
<xml_diff>
--- a/_workspace/books/content-generation-rules.docx
+++ b/_workspace/books/content-generation-rules.docx
@@ -1,10 +1,10 @@
 
 <file path=word/document.xml><?xml version="1.0" encoding="utf-8"?>
-<w:document xmlns:wpc="http://schemas.microsoft.com/office/word/2010/wordprocessingCanvas" xmlns:cx="http://schemas.microsoft.com/office/drawing/2014/chartex" xmlns:cx1="http://schemas.microsoft.com/office/drawing/2015/9/8/chartex" xmlns:cx2="http://schemas.microsoft.com/office/drawing/2015/10/21/chartex" xmlns:cx3="http://schemas.microsoft.com/office/drawing/2016/5/9/chartex" xmlns:cx4="http://schemas.microsoft.com/office/drawing/2016/5/10/chartex" xmlns:cx5="http://schemas.microsoft.com/office/drawing/2016/5/11/chartex" xmlns:cx6="http://schemas.microsoft.com/office/drawing/2016/5/12/chartex" xmlns:cx7="http://schemas.microsoft.com/office/drawing/2016/5/13/chartex" xmlns:cx8="http://schemas.microsoft.com/office/drawing/2016/5/14/chartex" xmlns:mc="http://schemas.openxmlformats.org/markup-compatibility/2006" xmlns:aink="http://schemas.microsoft.com/office/drawing/2016/ink" xmlns:am3d="http://schemas.microsoft.com/office/drawing/2017/model3d" xmlns:o="urn:schemas-microsoft-com:office:office" xmlns:oel="http://schemas.microsoft.com/office/2019/extlst" xmlns:r="http://schemas.openxmlformats.org/officeDocument/2006/relationships" xmlns:m="http://schemas.openxmlformats.org/officeDocument/2006/math" xmlns:v="urn:schemas-microsoft-com:vml" xmlns:wp14="http://schemas.microsoft.com/office/word/2010/wordprocessingDrawing" xmlns:wp="http://schemas.openxmlformats.org/drawingml/2006/wordprocessingDrawing" xmlns:w10="urn:schemas-microsoft-com:office:word" xmlns:w="http://schemas.openxmlformats.org/wordprocessingml/2006/main" xmlns:w14="http://schemas.microsoft.com/office/word/2010/wordml" xmlns:w15="http://schemas.microsoft.com/office/word/2012/wordml" xmlns:w16cex="http://schemas.microsoft.com/office/word/2018/wordml/cex" xmlns:w16cid="http://schemas.microsoft.com/office/word/2016/wordml/cid" xmlns:w16="http://schemas.microsoft.com/office/word/2018/wordml" xmlns:w16du="http://schemas.microsoft.com/office/word/2023/wordml/word16du" xmlns:w16sdtdh="http://schemas.microsoft.com/office/word/2020/wordml/sdtdatahash" xmlns:w16sdtfl="http://schemas.microsoft.com/office/word/2024/wordml/sdtformatlock" xmlns:w16se="http://schemas.microsoft.com/office/word/2015/wordml/symex" xmlns:wpg="http://schemas.microsoft.com/office/word/2010/wordprocessingGroup" xmlns:wpi="http://schemas.microsoft.com/office/word/2010/wordprocessingInk" xmlns:wne="http://schemas.microsoft.com/office/word/2006/wordml" xmlns:wps="http://schemas.microsoft.com/office/word/2010/wordprocessingShape" mc:Ignorable="w14 w15 w16se w16cid w16 w16cex w16sdtdh w16sdtfl w16du wp14">
+<w:document xmlns:wpc="http://schemas.microsoft.com/office/word/2010/wordprocessingCanvas" xmlns:cx="http://schemas.microsoft.com/office/drawing/2014/chartex" xmlns:cx1="http://schemas.microsoft.com/office/drawing/2015/9/8/chartex" xmlns:cx2="http://schemas.microsoft.com/office/drawing/2015/10/21/chartex" xmlns:cx3="http://schemas.microsoft.com/office/drawing/2016/5/9/chartex" xmlns:cx4="http://schemas.microsoft.com/office/drawing/2016/5/10/chartex" xmlns:cx5="http://schemas.microsoft.com/office/drawing/2016/5/11/chartex" xmlns:cx6="http://schemas.microsoft.com/office/drawing/2016/5/12/chartex" xmlns:cx7="http://schemas.microsoft.com/office/drawing/2016/5/13/chartex" xmlns:cx8="http://schemas.microsoft.com/office/drawing/2016/5/14/chartex" xmlns:mc="http://schemas.openxmlformats.org/markup-compatibility/2006" xmlns:aink="http://schemas.microsoft.com/office/drawing/2016/ink" xmlns:am3d="http://schemas.microsoft.com/office/drawing/2017/model3d" xmlns:o="urn:schemas-microsoft-com:office:office" xmlns:oel="http://schemas.microsoft.com/office/2019/extlst" xmlns:r="http://schemas.openxmlformats.org/officeDocument/2006/relationships" xmlns:m="http://schemas.openxmlformats.org/officeDocument/2006/math" xmlns:v="urn:schemas-microsoft-com:vml" xmlns:wp14="http://schemas.microsoft.com/office/word/2010/wordprocessingDrawing" xmlns:wp="http://schemas.openxmlformats.org/drawingml/2006/wordprocessingDrawing" xmlns:w10="urn:schemas-microsoft-com:office:word" xmlns:w="http://schemas.openxmlformats.org/wordprocessingml/2006/main" xmlns:w14="http://schemas.microsoft.com/office/word/2010/wordml" xmlns:w15="http://schemas.microsoft.com/office/word/2012/wordml" xmlns:w16cei="http://schemas.microsoft.com/office/word/2026/wordml/cei" xmlns:w16cex="http://schemas.microsoft.com/office/word/2018/wordml/cex" xmlns:w16cid="http://schemas.microsoft.com/office/word/2016/wordml/cid" xmlns:w16="http://schemas.microsoft.com/office/word/2018/wordml" xmlns:w16du="http://schemas.microsoft.com/office/word/2023/wordml/word16du" xmlns:w16sdtdh="http://schemas.microsoft.com/office/word/2020/wordml/sdtdatahash" xmlns:w16sdtfl="http://schemas.microsoft.com/office/word/2024/wordml/sdtformatlock" xmlns:w16se="http://schemas.microsoft.com/office/word/2015/wordml/symex" xmlns:wpg="http://schemas.microsoft.com/office/word/2010/wordprocessingGroup" xmlns:wpi="http://schemas.microsoft.com/office/word/2010/wordprocessingInk" xmlns:wne="http://schemas.microsoft.com/office/word/2006/wordml" xmlns:wps="http://schemas.microsoft.com/office/word/2010/wordprocessingShape" mc:Ignorable="w14 w15 w16se w16cid w16 w16cex w16sdtdh w16sdtfl w16du wp14">
   <w:body>
     <w:p>
       <w:pPr>
-        <w:pStyle w:val="p1"/>
+        <w:pStyle w:val="Heading1"/>
       </w:pPr>
       <w:r>
         <w:rPr>
@@ -15,7 +15,7 @@
     </w:p>
     <w:p>
       <w:pPr>
-        <w:pStyle w:val="p2"/>
+        <w:pStyle w:val="Heading2"/>
       </w:pPr>
       <w:r>
         <w:rPr>
@@ -252,7 +252,7 @@
     </w:p>
     <w:p>
       <w:pPr>
-        <w:pStyle w:val="p6"/>
+        <w:pStyle w:val="Heading2"/>
       </w:pPr>
       <w:r>
         <w:rPr>
@@ -318,7 +318,21 @@
         <w:rPr>
           <w:rStyle w:val="s3"/>
         </w:rPr>
-        <w:t xml:space="preserve"> If a scene crosses midnight (e.g., late-night talks, nightmares, parties), a brand new chapter must be started immediately to reflect the new date.</w:t>
+        <w:t xml:space="preserve"> If a scene crosses midnight (e.g., late-night talks, nightmares, parties), a </w:t>
+      </w:r>
+      <w:proofErr w:type="gramStart"/>
+      <w:r>
+        <w:rPr>
+          <w:rStyle w:val="s3"/>
+        </w:rPr>
+        <w:t>brand new</w:t>
+      </w:r>
+      <w:proofErr w:type="gramEnd"/>
+      <w:r>
+        <w:rPr>
+          <w:rStyle w:val="s3"/>
+        </w:rPr>
+        <w:t xml:space="preserve"> chapter must be started immediately to reflect the new date.</w:t>
       </w:r>
     </w:p>
     <w:p>
@@ -347,7 +361,7 @@
     </w:p>
     <w:p>
       <w:pPr>
-        <w:pStyle w:val="p6"/>
+        <w:pStyle w:val="Heading2"/>
       </w:pPr>
       <w:r>
         <w:rPr>
@@ -377,12 +391,26 @@
         <w:rPr>
           <w:rStyle w:val="s3"/>
         </w:rPr>
-        <w:t xml:space="preserve"> The narrative must stay strictly grounded in the immediate reality and perspective of the characters in the scene. Avoid breaking the fourth wall, heavy-handed foreshadowing, or explicitly explaining future plot points (e.g., telling the reader about "the dorm's worst-kept secret" before the characters organically experience the rumors). Show, don't tell.</w:t>
+        <w:t xml:space="preserve"> The narrative must stay strictly grounded in the immediate reality and perspective of the characters in the scene. Avoid breaking the fourth wall, heavy-handed foreshadowing, or explicitly explaining future plot points (e.g., telling the reader about "the dorm's worst-kept secret" before the characters organically experience the rumors). </w:t>
+      </w:r>
+      <w:proofErr w:type="gramStart"/>
+      <w:r>
+        <w:rPr>
+          <w:rStyle w:val="s3"/>
+        </w:rPr>
+        <w:t>Show,</w:t>
+      </w:r>
+      <w:proofErr w:type="gramEnd"/>
+      <w:r>
+        <w:rPr>
+          <w:rStyle w:val="s3"/>
+        </w:rPr>
+        <w:t xml:space="preserve"> don't tell.</w:t>
       </w:r>
     </w:p>
     <w:p>
       <w:pPr>
-        <w:pStyle w:val="p6"/>
+        <w:pStyle w:val="Heading2"/>
       </w:pPr>
       <w:r>
         <w:rPr>
@@ -415,7 +443,21 @@
         <w:rPr>
           <w:rStyle w:val="s3"/>
         </w:rPr>
-        <w:t xml:space="preserve"> If a sequence contains explicit intimacy, detailed anatomical explanations, or intense medical/sexual trauma topics that will trigger AI safety filters (e.g., "An Unconventional Study Session"), the AI is instructed to rewrite the scene as a tasteful, high-level narrative summary. The rewrite must focus entirely on the emotional weight, </w:t>
+        <w:t xml:space="preserve"> If a sequence contains explicit intimacy, detailed anatomical explanations, or intense medical/sexual trauma topics that will trigger AI safety filters (e.g., "An Unconventional Study Session"), the AI is instructed to rewrite the scene as a tasteful, high-level narrative summary. The rewrite must focus entirely on </w:t>
+      </w:r>
+      <w:proofErr w:type="gramStart"/>
+      <w:r>
+        <w:rPr>
+          <w:rStyle w:val="s3"/>
+        </w:rPr>
+        <w:t>the emotional</w:t>
+      </w:r>
+      <w:proofErr w:type="gramEnd"/>
+      <w:r>
+        <w:rPr>
+          <w:rStyle w:val="s3"/>
+        </w:rPr>
+        <w:t xml:space="preserve"> weight, </w:t>
       </w:r>
       <w:r>
         <w:rPr>
@@ -436,13 +478,37 @@
         <w:t>No Copyrighted or Trademarked Material:</w:t>
       </w:r>
       <w:r>
-        <w:t xml:space="preserve"> if, in the course of content generation, we cone across a copyrighted or trademarked word, we must substitute it for an in-universe brand.</w:t>
+        <w:t xml:space="preserve"> if, </w:t>
+      </w:r>
+      <w:proofErr w:type="gramStart"/>
+      <w:r>
+        <w:t>in the course of</w:t>
+      </w:r>
+      <w:proofErr w:type="gramEnd"/>
+      <w:r>
+        <w:t xml:space="preserve"> content generation, we </w:t>
+      </w:r>
+      <w:proofErr w:type="gramStart"/>
+      <w:r>
+        <w:t>cone</w:t>
+      </w:r>
+      <w:proofErr w:type="gramEnd"/>
+      <w:r>
+        <w:t xml:space="preserve"> across a copyrighted or trademarked word, we must substitute it for an in-universe brand.</w:t>
       </w:r>
       <w:r>
         <w:t xml:space="preserve"> If a suitable substitute is not on the attached list, we should come up with a plausible in-universe brand OR simply use a generic word as a copyright safe replacement. The goal is to produce content that does not</w:t>
       </w:r>
       <w:r>
-        <w:t xml:space="preserve"> earn a Cease and Desist letter.</w:t>
+        <w:t xml:space="preserve"> earn a </w:t>
+      </w:r>
+      <w:proofErr w:type="gramStart"/>
+      <w:r>
+        <w:t>Cease and Desist</w:t>
+      </w:r>
+      <w:proofErr w:type="gramEnd"/>
+      <w:r>
+        <w:t xml:space="preserve"> letter.</w:t>
       </w:r>
     </w:p>
     <w:p/>
@@ -884,7 +950,6 @@
     <w:next w:val="Normal"/>
     <w:link w:val="Heading2Char"/>
     <w:uiPriority w:val="9"/>
-    <w:semiHidden/>
     <w:unhideWhenUsed/>
     <w:qFormat/>
     <w:rsid w:val="0087665E"/>
@@ -1101,7 +1166,6 @@
     <w:basedOn w:val="DefaultParagraphFont"/>
     <w:link w:val="Heading2"/>
     <w:uiPriority w:val="9"/>
-    <w:semiHidden/>
     <w:rsid w:val="0087665E"/>
     <w:rPr>
       <w:rFonts w:asciiTheme="majorHAnsi" w:eastAsiaTheme="majorEastAsia" w:hAnsiTheme="majorHAnsi" w:cstheme="majorBidi"/>

</xml_diff>